<commit_message>
Añado contenido a la memoria
</commit_message>
<xml_diff>
--- a/Memoria poyecto IA (español).docx
+++ b/Memoria poyecto IA (español).docx
@@ -180,13 +180,8 @@
       <w:r>
         <w:t xml:space="preserve">                                                                        </w:t>
       </w:r>
-      <w:proofErr w:type="spellStart"/>
-      <w:r>
-        <w:t>Jose</w:t>
-      </w:r>
-      <w:proofErr w:type="spellEnd"/>
-      <w:r>
-        <w:t xml:space="preserve"> Carlos Grau Ibanez</w:t>
+      <w:r>
+        <w:t>Jose Carlos Grau Ibanez</w:t>
       </w:r>
     </w:p>
     <w:p>
@@ -288,48 +283,28 @@
     </w:p>
     <w:p>
       <w:r>
-        <w:t xml:space="preserve">2.1 Inteligencia Artificial y Deep </w:t>
-      </w:r>
-      <w:proofErr w:type="spellStart"/>
-      <w:r>
-        <w:t>Learning</w:t>
-      </w:r>
-      <w:proofErr w:type="spellEnd"/>
+        <w:t>2.1 Inteligencia Artificial y Deep Learning</w:t>
+      </w:r>
       <w:r>
         <w:br/>
         <w:t>2.2 Redes Neuronales Convolucionales (CNN)</w:t>
       </w:r>
       <w:r>
         <w:br/>
-        <w:t xml:space="preserve">2.3 Transfer </w:t>
-      </w:r>
-      <w:proofErr w:type="spellStart"/>
-      <w:r>
-        <w:t>Learning</w:t>
-      </w:r>
-      <w:proofErr w:type="spellEnd"/>
-      <w:r>
-        <w:br/>
-        <w:t xml:space="preserve">2.4 Modelos </w:t>
-      </w:r>
-      <w:proofErr w:type="spellStart"/>
-      <w:r>
-        <w:t>preentrenados</w:t>
-      </w:r>
-      <w:proofErr w:type="spellEnd"/>
+        <w:t>2.3 Transfer Learning</w:t>
+      </w:r>
+      <w:r>
+        <w:br/>
+        <w:t>2.4 Modelos preentrenados</w:t>
+      </w:r>
       <w:r>
         <w:br/>
         <w:t>2.5 MobileNetV2</w:t>
       </w:r>
       <w:r>
         <w:br/>
-        <w:t xml:space="preserve">2.6 Data </w:t>
-      </w:r>
-      <w:proofErr w:type="spellStart"/>
-      <w:r>
-        <w:t>Augmentation</w:t>
-      </w:r>
-      <w:proofErr w:type="spellEnd"/>
+        <w:t>2.6 Data Augmentation</w:t>
+      </w:r>
       <w:r>
         <w:br/>
         <w:t>2.7 Métricas de evaluación</w:t>
@@ -353,13 +328,8 @@
     </w:p>
     <w:p>
       <w:r>
-        <w:t xml:space="preserve">3.1 Descripción del </w:t>
-      </w:r>
-      <w:proofErr w:type="spellStart"/>
-      <w:r>
-        <w:t>dataset</w:t>
-      </w:r>
-      <w:proofErr w:type="spellEnd"/>
+        <w:t>3.1 Descripción del dataset</w:t>
+      </w:r>
       <w:r>
         <w:br/>
         <w:t>3.2 Exploración inicial de los datos (EDA)</w:t>
@@ -468,23 +438,13 @@
     </w:p>
     <w:p>
       <w:r>
-        <w:t xml:space="preserve">6.1 Comparación entre modelo desde cero y modelo </w:t>
-      </w:r>
-      <w:proofErr w:type="spellStart"/>
-      <w:r>
-        <w:t>preentrenado</w:t>
-      </w:r>
-      <w:proofErr w:type="spellEnd"/>
-    </w:p>
-    <w:p>
-      <w:r>
-        <w:t xml:space="preserve">6.2 Comparación con y sin Data </w:t>
-      </w:r>
-      <w:proofErr w:type="spellStart"/>
-      <w:r>
-        <w:t>Augmentation</w:t>
-      </w:r>
-      <w:proofErr w:type="spellEnd"/>
+        <w:t>6.1 Comparación entre modelo desde cero y modelo preentrenado</w:t>
+      </w:r>
+    </w:p>
+    <w:p>
+      <w:r>
+        <w:t>6.2 Comparación con y sin Data Augmentation</w:t>
+      </w:r>
     </w:p>
     <w:p>
       <w:r>
@@ -650,36 +610,12 @@
     </w:p>
     <w:p>
       <w:r>
-        <w:t xml:space="preserve">En los últimos años, la inteligencia artificial y sus técnicas como el Deep </w:t>
-      </w:r>
-      <w:proofErr w:type="spellStart"/>
-      <w:r>
-        <w:t>Learning</w:t>
-      </w:r>
-      <w:proofErr w:type="spellEnd"/>
-      <w:r>
-        <w:t xml:space="preserve"> han supuesto un avance muy grande en el campo de la visión por ordenador. Gracias a estos avances hoy en día es posible analizar todo tipo de imágenes en segundos y de forma automática para extraer información que nos es útil para resolver una serie de problemas </w:t>
-      </w:r>
-      <w:proofErr w:type="spellStart"/>
-      <w:r>
-        <w:t>mas</w:t>
-      </w:r>
-      <w:proofErr w:type="spellEnd"/>
-      <w:r>
-        <w:t xml:space="preserve"> complejos, detectar elementos dentro de esas imágenes o incluso reconocer personas o animales.</w:t>
-      </w:r>
-    </w:p>
-    <w:p>
-      <w:r>
-        <w:t xml:space="preserve">En este proyecto vamos a abordar el problema de la clasificación de imágenes multiclase para predecir el país en el que han sido sacadas a partir del contenido de esas mismas imágenes, para ello vamos a utilizar técnicas de aprendizaje profundo, modelos </w:t>
-      </w:r>
-      <w:proofErr w:type="spellStart"/>
-      <w:r>
-        <w:t>preentrenados</w:t>
-      </w:r>
-      <w:proofErr w:type="spellEnd"/>
-      <w:r>
-        <w:t>,… realizando un estudio comparativo de distintos modelos para obtener el mayor rendimiento posible para este experimento.</w:t>
+        <w:t>En los últimos años, la inteligencia artificial y sus técnicas como el Deep Learning han supuesto un avance muy grande en el campo de la visión por ordenador. Gracias a estos avances hoy en día es posible analizar todo tipo de imágenes en segundos y de forma automática para extraer información que nos es útil para resolver una serie de problemas mas complejos, detectar elementos dentro de esas imágenes o incluso reconocer personas o animales.</w:t>
+      </w:r>
+    </w:p>
+    <w:p>
+      <w:r>
+        <w:t>En este proyecto vamos a abordar el problema de la clasificación de imágenes multiclase para predecir el país en el que han sido sacadas a partir del contenido de esas mismas imágenes, para ello vamos a utilizar técnicas de aprendizaje profundo, modelos preentrenados,… realizando un estudio comparativo de distintos modelos para obtener el mayor rendimiento posible para este experimento.</w:t>
       </w:r>
     </w:p>
     <w:p>
@@ -724,15 +660,7 @@
         <w:t>Como ya comentamos en los últimos años, la Inteligencia Artificial (en adelante IA) ha crecido de manera exponencial</w:t>
       </w:r>
       <w:r>
-        <w:t xml:space="preserve"> gracias al aumento de la capacidad de cálculo, la disponibilidad de grandes volúmenes de datos y el desarrollo de nuevas técnicas de aprendizaje profundo y automático. Dentro de todo esto, el Deep </w:t>
-      </w:r>
-      <w:proofErr w:type="spellStart"/>
-      <w:r>
-        <w:t>Learning</w:t>
-      </w:r>
-      <w:proofErr w:type="spellEnd"/>
-      <w:r>
-        <w:t xml:space="preserve"> (aprendizaje profundo) ha supuesto un gran avance en el análisis y procesamiento de imágenes superando con creces a los métodos tradicionales.</w:t>
+        <w:t xml:space="preserve"> gracias al aumento de la capacidad de cálculo, la disponibilidad de grandes volúmenes de datos y el desarrollo de nuevas técnicas de aprendizaje profundo y automático. Dentro de todo esto, el Deep Learning (aprendizaje profundo) ha supuesto un gran avance en el análisis y procesamiento de imágenes superando con creces a los métodos tradicionales.</w:t>
       </w:r>
       <w:r>
         <w:t xml:space="preserve"> </w:t>
@@ -794,7 +722,48 @@
         <w:t xml:space="preserve"> </w:t>
       </w:r>
     </w:p>
-    <w:p/>
+    <w:p>
+      <w:r>
+        <w:t xml:space="preserve">La idea principal para realizar este proyecto surge de la curiosidad por conocer como funcionan los modelos de inteligencia artificial de reconocimiento y clasificación de </w:t>
+      </w:r>
+      <w:r>
+        <w:t xml:space="preserve">imágenes, asi como la curiosidad de saber si realmente un modelo de IA va a ser capaz de diferenciar países solo con imágenes. </w:t>
+      </w:r>
+    </w:p>
+    <w:p>
+      <w:r>
+        <w:t>Durante toda la trayectoria de este curso hemos estudiado diferentes técnicas de aprendizaje profundo y modelos de IA per consideramos que la mejor forma de aprender su funcionamiento es aplicarlas en un problema real y por nosotros mismos, por ello hemos centrado la idea de este proyecto en comparar distintas estrategias de entrenamiento para comprobar de primera mano cual ofrece mejores resultados. En concreto se estudiará el comportamiento de una red neuronal entrenada desde cero y de un modelo preentrenado, así como la influencia de técnicas como el Data Augmentation o el Fine Tuning.</w:t>
+      </w:r>
+    </w:p>
+    <w:p>
+      <w:r>
+        <w:t xml:space="preserve">Por último, el desarrollo de este </w:t>
+      </w:r>
+      <w:r>
+        <w:t>proyecto</w:t>
+      </w:r>
+      <w:r>
+        <w:t xml:space="preserve"> nos ha permitido recorrer todas las etapas de un proyecto </w:t>
+      </w:r>
+      <w:r>
+        <w:t>estas características</w:t>
+      </w:r>
+      <w:r>
+        <w:t>, desde la exploración</w:t>
+      </w:r>
+      <w:r>
+        <w:t>, limpieza</w:t>
+      </w:r>
+      <w:r>
+        <w:t xml:space="preserve"> y preparación de los datos hasta el entrenamiento, la evaluación y el análisis de los resultados obtenidos. Creemos que esta experiencia nos </w:t>
+      </w:r>
+      <w:r>
+        <w:t>ha ayudado</w:t>
+      </w:r>
+      <w:r>
+        <w:t xml:space="preserve"> a comprender mejor tanto los conceptos vistos en clase como su aplicación en problemas reales.</w:t>
+      </w:r>
+    </w:p>
     <w:p>
       <w:pPr>
         <w:rPr>
@@ -827,7 +796,172 @@
         <w:t xml:space="preserve"> </w:t>
       </w:r>
     </w:p>
-    <w:p/>
+    <w:p>
+      <w:r>
+        <w:t xml:space="preserve">El objetivo principal de este proyecto es entrenar un modelo de IA para que sea capaz de predecir </w:t>
+      </w:r>
+      <w:r>
+        <w:t>el país del que se trata solamente dándole una imagen. Para ello vamos a utilizar técnicas de aprendizaje profundo y aprendizaje de transferencia.</w:t>
+      </w:r>
+    </w:p>
+    <w:p>
+      <w:r>
+        <w:t>Para ser capaces de alcanzar este objetivo principal, hemos planteado una serie de objetivos específicos, son los siguientes:</w:t>
+      </w:r>
+    </w:p>
+    <w:p>
+      <w:pPr>
+        <w:numPr>
+          <w:ilvl w:val="0"/>
+          <w:numId w:val="6"/>
+        </w:numPr>
+      </w:pPr>
+      <w:r>
+        <w:lastRenderedPageBreak/>
+        <w:t>Analizar</w:t>
+      </w:r>
+      <w:r>
+        <w:t xml:space="preserve"> el conjunto de datos para conocer su </w:t>
+      </w:r>
+      <w:r>
+        <w:t>distribución y la calidad de sus datos</w:t>
+      </w:r>
+      <w:r>
+        <w:t>.</w:t>
+      </w:r>
+    </w:p>
+    <w:p>
+      <w:pPr>
+        <w:numPr>
+          <w:ilvl w:val="0"/>
+          <w:numId w:val="6"/>
+        </w:numPr>
+      </w:pPr>
+      <w:r>
+        <w:t>Preprocesar</w:t>
+      </w:r>
+      <w:r>
+        <w:t xml:space="preserve"> las imágenes</w:t>
+      </w:r>
+      <w:r>
+        <w:t xml:space="preserve"> del conjunto de datos eliminando las imágenes no válidas, limpiando el conjunto de datos y dejandolo listo para después poder entrenar el modelo con dichos datos</w:t>
+      </w:r>
+    </w:p>
+    <w:p>
+      <w:pPr>
+        <w:numPr>
+          <w:ilvl w:val="0"/>
+          <w:numId w:val="6"/>
+        </w:numPr>
+      </w:pPr>
+      <w:r>
+        <w:t>Implementar un modelo de clasificación de imágenes basado en una red neuronal convolucional entrenada desde cero.</w:t>
+      </w:r>
+    </w:p>
+    <w:p>
+      <w:pPr>
+        <w:numPr>
+          <w:ilvl w:val="0"/>
+          <w:numId w:val="6"/>
+        </w:numPr>
+      </w:pPr>
+      <w:r>
+        <w:t xml:space="preserve">Implementar un modelo preentrenado y aplicar técnicas de </w:t>
+      </w:r>
+      <w:r>
+        <w:rPr>
+          <w:i/>
+          <w:iCs/>
+        </w:rPr>
+        <w:t>Transfer Learning</w:t>
+      </w:r>
+      <w:r>
+        <w:t>.</w:t>
+      </w:r>
+    </w:p>
+    <w:p>
+      <w:pPr>
+        <w:numPr>
+          <w:ilvl w:val="0"/>
+          <w:numId w:val="6"/>
+        </w:numPr>
+      </w:pPr>
+      <w:r>
+        <w:t>Comparar el rendimiento de ambos modelos para evaluar las ventajas e inconvenientes de cada estrategia de entrenamiento.</w:t>
+      </w:r>
+    </w:p>
+    <w:p>
+      <w:pPr>
+        <w:numPr>
+          <w:ilvl w:val="0"/>
+          <w:numId w:val="6"/>
+        </w:numPr>
+      </w:pPr>
+      <w:r>
+        <w:t xml:space="preserve">Analizar </w:t>
+      </w:r>
+      <w:r>
+        <w:t xml:space="preserve">cómo influye en el resultado </w:t>
+      </w:r>
+      <w:r>
+        <w:t xml:space="preserve">el uso de técnicas como </w:t>
+      </w:r>
+      <w:r>
+        <w:rPr>
+          <w:i/>
+          <w:iCs/>
+        </w:rPr>
+        <w:t>Data Augmentation</w:t>
+      </w:r>
+      <w:r>
+        <w:t xml:space="preserve"> y </w:t>
+      </w:r>
+      <w:r>
+        <w:rPr>
+          <w:i/>
+          <w:iCs/>
+        </w:rPr>
+        <w:t>Fine Tun</w:t>
+      </w:r>
+      <w:r>
+        <w:rPr>
+          <w:i/>
+          <w:iCs/>
+        </w:rPr>
+        <w:t>ing</w:t>
+      </w:r>
+    </w:p>
+    <w:p>
+      <w:pPr>
+        <w:numPr>
+          <w:ilvl w:val="0"/>
+          <w:numId w:val="6"/>
+        </w:numPr>
+      </w:pPr>
+      <w:r>
+        <w:t>Seleccionar la configuración que ofrezca los mejores resultados</w:t>
+      </w:r>
+      <w:r>
+        <w:t xml:space="preserve"> entre las pruebas hechas anteriormente</w:t>
+      </w:r>
+      <w:r>
+        <w:t xml:space="preserve"> y entrenar el modelo final.</w:t>
+      </w:r>
+    </w:p>
+    <w:p>
+      <w:pPr>
+        <w:numPr>
+          <w:ilvl w:val="0"/>
+          <w:numId w:val="6"/>
+        </w:numPr>
+      </w:pPr>
+      <w:r>
+        <w:t>Evaluar el comportamiento del modelo mediante diferentes métricas y analizar los resultados obtenidos para extraer las conclusiones del estudio</w:t>
+      </w:r>
+      <w:r>
+        <w:t xml:space="preserve"> y ver si realmente un modelo de IA es capaz de identificar las imágenes de países correctamente o no.</w:t>
+      </w:r>
+    </w:p>
     <w:p>
       <w:pPr>
         <w:rPr>
@@ -860,6 +994,30 @@
         <w:t>del proyecto</w:t>
       </w:r>
     </w:p>
+    <w:p>
+      <w:r>
+        <w:t>El desarrollo del proyecto se ha realizado de forma colaborativa entre todos los autores del mismo</w:t>
+      </w:r>
+      <w:r>
+        <w:t>, para facilitar el trabajo en grupo y mantener el control de las diferentes versiones del código y de toda la documentación se ha creado un repositorio en github que nos sirve como plataforma común en la que se almacena tanto el código como la memoria y distintos documentos asociados, de esta manera es posible actualizar el proyecto a medida que se avanza.</w:t>
+      </w:r>
+    </w:p>
+    <w:p>
+      <w:r>
+        <w:t>La metodología de trabajo que hemos seguido ha sido flexible y adaptada a la disponibilidad de cada miembro del grupo. Cada uno de los integrantes del grupo ha ido desarrollando las distintas partes del proyecto cuando disponía de tiempo y después incorporando las modificaciones realizadas tanto en el código como en la memoria actualizando el repositorio en github. De esta forma todos los integrantes del grupo han podido participar activamente en todas las fases del proyecto, aportando ideas, realizando las mejoras oportunas y revisando el trabajo que realizaba el resto del equipo.</w:t>
+      </w:r>
+    </w:p>
+    <w:p>
+      <w:r>
+        <w:lastRenderedPageBreak/>
+        <w:t>Adicionalmente, de forma periódica se han realizado reuniones de seguimiento con el objetivo de poner en común los avances realizados, la forma de continuar con el proyecto, resolver dudas, tomar decisiones sobre el proyecto…</w:t>
+      </w:r>
+    </w:p>
+    <w:p>
+      <w:r>
+        <w:t>En cuanto a la estructura de la memoria, se ha organizado de forma similar a como hemos desarrollado el proyecto, es decir, primero se presentan los fundamentos teóricos en los que se ha basado este proyecto, luego se describen los datos utilizados para entrenar el modelo así como su preprocesado, posteriormente se explican los experimentos llevados a cabo y por último se entrena el modelo final y se presentan las conclusiones.</w:t>
+      </w:r>
+    </w:p>
     <w:p/>
     <w:p/>
     <w:p>
@@ -908,75 +1066,43 @@
         <w:rPr>
           <w:u w:val="single"/>
         </w:rPr>
-        <w:t xml:space="preserve">2.1 Inteligencia Artificial y Deep </w:t>
-      </w:r>
-      <w:proofErr w:type="spellStart"/>
+        <w:t>2.1 Inteligencia Artificial y Deep Learning</w:t>
+      </w:r>
       <w:r>
         <w:rPr>
           <w:u w:val="single"/>
         </w:rPr>
-        <w:t>Learning</w:t>
-      </w:r>
-      <w:proofErr w:type="spellEnd"/>
+        <w:br/>
+        <w:t>2.2 Redes Neuronales Convolucionales (CNN)</w:t>
+      </w:r>
       <w:r>
         <w:rPr>
           <w:u w:val="single"/>
         </w:rPr>
         <w:br/>
-        <w:t>2.2 Redes Neuronales Convolucionales (CNN)</w:t>
+        <w:t>2.3 Transfer Learning</w:t>
       </w:r>
       <w:r>
         <w:rPr>
           <w:u w:val="single"/>
         </w:rPr>
         <w:br/>
-        <w:t xml:space="preserve">2.3 Transfer </w:t>
-      </w:r>
-      <w:proofErr w:type="spellStart"/>
+        <w:t>2.4 Modelos preentrenados</w:t>
+      </w:r>
       <w:r>
         <w:rPr>
           <w:u w:val="single"/>
         </w:rPr>
-        <w:t>Learning</w:t>
-      </w:r>
-      <w:proofErr w:type="spellEnd"/>
+        <w:br/>
+        <w:t>2.5 MobileNetV2</w:t>
+      </w:r>
       <w:r>
         <w:rPr>
           <w:u w:val="single"/>
         </w:rPr>
         <w:br/>
-        <w:t xml:space="preserve">2.4 Modelos </w:t>
-      </w:r>
-      <w:proofErr w:type="spellStart"/>
-      <w:r>
-        <w:rPr>
-          <w:u w:val="single"/>
-        </w:rPr>
-        <w:t>preentrenados</w:t>
-      </w:r>
-      <w:proofErr w:type="spellEnd"/>
-      <w:r>
-        <w:rPr>
-          <w:u w:val="single"/>
-        </w:rPr>
-        <w:br/>
-        <w:t>2.5 MobileNetV2</w:t>
-      </w:r>
-      <w:r>
-        <w:rPr>
-          <w:u w:val="single"/>
-        </w:rPr>
-        <w:br/>
-        <w:t xml:space="preserve">2.6 Data </w:t>
-      </w:r>
-      <w:proofErr w:type="spellStart"/>
-      <w:r>
-        <w:rPr>
-          <w:u w:val="single"/>
-        </w:rPr>
-        <w:t>Augmentation</w:t>
-      </w:r>
-      <w:proofErr w:type="spellEnd"/>
+        <w:t>2.6 Data Augmentation</w:t>
+      </w:r>
       <w:r>
         <w:rPr>
           <w:u w:val="single"/>
@@ -1034,24 +1160,23 @@
           <w:i/>
           <w:iCs/>
         </w:rPr>
-        <w:t xml:space="preserve">3.1 Descripción del </w:t>
-      </w:r>
-      <w:proofErr w:type="spellStart"/>
+        <w:t>3.1 Descripción del dataset</w:t>
+      </w:r>
       <w:r>
         <w:rPr>
           <w:i/>
           <w:iCs/>
         </w:rPr>
-        <w:t>dataset</w:t>
-      </w:r>
-      <w:proofErr w:type="spellEnd"/>
+        <w:br/>
+        <w:t>3.2 Exploración inicial de los datos (EDA)</w:t>
+      </w:r>
       <w:r>
         <w:rPr>
           <w:i/>
           <w:iCs/>
         </w:rPr>
         <w:br/>
-        <w:t>3.2 Exploración inicial de los datos (EDA)</w:t>
+        <w:t>3.3 Distribución de imágenes por país</w:t>
       </w:r>
       <w:r>
         <w:rPr>
@@ -1059,7 +1184,7 @@
           <w:iCs/>
         </w:rPr>
         <w:br/>
-        <w:t>3.3 Distribución de imágenes por país</w:t>
+        <w:t>3.4 Visualización de ejemplos</w:t>
       </w:r>
       <w:r>
         <w:rPr>
@@ -1067,14 +1192,6 @@
           <w:iCs/>
         </w:rPr>
         <w:br/>
-        <w:t>3.4 Visualización de ejemplos</w:t>
-      </w:r>
-      <w:r>
-        <w:rPr>
-          <w:i/>
-          <w:iCs/>
-        </w:rPr>
-        <w:br/>
         <w:t>3.5 Selección del conjunto de datos para el proyecto</w:t>
       </w:r>
     </w:p>
@@ -1229,23 +1346,13 @@
     </w:p>
     <w:p>
       <w:r>
-        <w:t xml:space="preserve">6.1 Comparación entre modelo desde cero y modelo </w:t>
-      </w:r>
-      <w:proofErr w:type="spellStart"/>
-      <w:r>
-        <w:t>preentrenado</w:t>
-      </w:r>
-      <w:proofErr w:type="spellEnd"/>
-    </w:p>
-    <w:p>
-      <w:r>
-        <w:t xml:space="preserve">6.2 Comparación con y sin Data </w:t>
-      </w:r>
-      <w:proofErr w:type="spellStart"/>
-      <w:r>
-        <w:t>Augmentation</w:t>
-      </w:r>
-      <w:proofErr w:type="spellEnd"/>
+        <w:t>6.1 Comparación entre modelo desde cero y modelo preentrenado</w:t>
+      </w:r>
+    </w:p>
+    <w:p>
+      <w:r>
+        <w:t>6.2 Comparación con y sin Data Augmentation</w:t>
+      </w:r>
     </w:p>
     <w:p>
       <w:r>
@@ -1619,6 +1726,155 @@
     </w:lvl>
   </w:abstractNum>
   <w:abstractNum w:abstractNumId="1" w15:restartNumberingAfterBreak="0">
+    <w:nsid w:val="329835D4"/>
+    <w:multiLevelType w:val="multilevel"/>
+    <w:tmpl w:val="72A0CCB0"/>
+    <w:lvl w:ilvl="0">
+      <w:start w:val="1"/>
+      <w:numFmt w:val="bullet"/>
+      <w:lvlText w:val=""/>
+      <w:lvlJc w:val="left"/>
+      <w:pPr>
+        <w:tabs>
+          <w:tab w:val="num" w:pos="720"/>
+        </w:tabs>
+        <w:ind w:left="720" w:hanging="360"/>
+      </w:pPr>
+      <w:rPr>
+        <w:rFonts w:ascii="Symbol" w:hAnsi="Symbol" w:hint="default"/>
+        <w:sz w:val="20"/>
+      </w:rPr>
+    </w:lvl>
+    <w:lvl w:ilvl="1" w:tentative="1">
+      <w:start w:val="1"/>
+      <w:numFmt w:val="bullet"/>
+      <w:lvlText w:val="o"/>
+      <w:lvlJc w:val="left"/>
+      <w:pPr>
+        <w:tabs>
+          <w:tab w:val="num" w:pos="1440"/>
+        </w:tabs>
+        <w:ind w:left="1440" w:hanging="360"/>
+      </w:pPr>
+      <w:rPr>
+        <w:rFonts w:ascii="Courier New" w:hAnsi="Courier New" w:hint="default"/>
+        <w:sz w:val="20"/>
+      </w:rPr>
+    </w:lvl>
+    <w:lvl w:ilvl="2" w:tentative="1">
+      <w:start w:val="1"/>
+      <w:numFmt w:val="bullet"/>
+      <w:lvlText w:val=""/>
+      <w:lvlJc w:val="left"/>
+      <w:pPr>
+        <w:tabs>
+          <w:tab w:val="num" w:pos="2160"/>
+        </w:tabs>
+        <w:ind w:left="2160" w:hanging="360"/>
+      </w:pPr>
+      <w:rPr>
+        <w:rFonts w:ascii="Wingdings" w:hAnsi="Wingdings" w:hint="default"/>
+        <w:sz w:val="20"/>
+      </w:rPr>
+    </w:lvl>
+    <w:lvl w:ilvl="3" w:tentative="1">
+      <w:start w:val="1"/>
+      <w:numFmt w:val="bullet"/>
+      <w:lvlText w:val=""/>
+      <w:lvlJc w:val="left"/>
+      <w:pPr>
+        <w:tabs>
+          <w:tab w:val="num" w:pos="2880"/>
+        </w:tabs>
+        <w:ind w:left="2880" w:hanging="360"/>
+      </w:pPr>
+      <w:rPr>
+        <w:rFonts w:ascii="Wingdings" w:hAnsi="Wingdings" w:hint="default"/>
+        <w:sz w:val="20"/>
+      </w:rPr>
+    </w:lvl>
+    <w:lvl w:ilvl="4" w:tentative="1">
+      <w:start w:val="1"/>
+      <w:numFmt w:val="bullet"/>
+      <w:lvlText w:val=""/>
+      <w:lvlJc w:val="left"/>
+      <w:pPr>
+        <w:tabs>
+          <w:tab w:val="num" w:pos="3600"/>
+        </w:tabs>
+        <w:ind w:left="3600" w:hanging="360"/>
+      </w:pPr>
+      <w:rPr>
+        <w:rFonts w:ascii="Wingdings" w:hAnsi="Wingdings" w:hint="default"/>
+        <w:sz w:val="20"/>
+      </w:rPr>
+    </w:lvl>
+    <w:lvl w:ilvl="5" w:tentative="1">
+      <w:start w:val="1"/>
+      <w:numFmt w:val="bullet"/>
+      <w:lvlText w:val=""/>
+      <w:lvlJc w:val="left"/>
+      <w:pPr>
+        <w:tabs>
+          <w:tab w:val="num" w:pos="4320"/>
+        </w:tabs>
+        <w:ind w:left="4320" w:hanging="360"/>
+      </w:pPr>
+      <w:rPr>
+        <w:rFonts w:ascii="Wingdings" w:hAnsi="Wingdings" w:hint="default"/>
+        <w:sz w:val="20"/>
+      </w:rPr>
+    </w:lvl>
+    <w:lvl w:ilvl="6" w:tentative="1">
+      <w:start w:val="1"/>
+      <w:numFmt w:val="bullet"/>
+      <w:lvlText w:val=""/>
+      <w:lvlJc w:val="left"/>
+      <w:pPr>
+        <w:tabs>
+          <w:tab w:val="num" w:pos="5040"/>
+        </w:tabs>
+        <w:ind w:left="5040" w:hanging="360"/>
+      </w:pPr>
+      <w:rPr>
+        <w:rFonts w:ascii="Wingdings" w:hAnsi="Wingdings" w:hint="default"/>
+        <w:sz w:val="20"/>
+      </w:rPr>
+    </w:lvl>
+    <w:lvl w:ilvl="7" w:tentative="1">
+      <w:start w:val="1"/>
+      <w:numFmt w:val="bullet"/>
+      <w:lvlText w:val=""/>
+      <w:lvlJc w:val="left"/>
+      <w:pPr>
+        <w:tabs>
+          <w:tab w:val="num" w:pos="5760"/>
+        </w:tabs>
+        <w:ind w:left="5760" w:hanging="360"/>
+      </w:pPr>
+      <w:rPr>
+        <w:rFonts w:ascii="Wingdings" w:hAnsi="Wingdings" w:hint="default"/>
+        <w:sz w:val="20"/>
+      </w:rPr>
+    </w:lvl>
+    <w:lvl w:ilvl="8" w:tentative="1">
+      <w:start w:val="1"/>
+      <w:numFmt w:val="bullet"/>
+      <w:lvlText w:val=""/>
+      <w:lvlJc w:val="left"/>
+      <w:pPr>
+        <w:tabs>
+          <w:tab w:val="num" w:pos="6480"/>
+        </w:tabs>
+        <w:ind w:left="6480" w:hanging="360"/>
+      </w:pPr>
+      <w:rPr>
+        <w:rFonts w:ascii="Wingdings" w:hAnsi="Wingdings" w:hint="default"/>
+        <w:sz w:val="20"/>
+      </w:rPr>
+    </w:lvl>
+  </w:abstractNum>
+  <w:abstractNum w:abstractNumId="2" w15:restartNumberingAfterBreak="0">
     <w:nsid w:val="61C8125E"/>
     <w:multiLevelType w:val="multilevel"/>
     <w:tmpl w:val="A424A846"/>
@@ -1767,7 +2023,7 @@
       </w:rPr>
     </w:lvl>
   </w:abstractNum>
-  <w:abstractNum w:abstractNumId="2" w15:restartNumberingAfterBreak="0">
+  <w:abstractNum w:abstractNumId="3" w15:restartNumberingAfterBreak="0">
     <w:nsid w:val="699A1791"/>
     <w:multiLevelType w:val="multilevel"/>
     <w:tmpl w:val="AB36D156"/>
@@ -1916,7 +2172,7 @@
       </w:rPr>
     </w:lvl>
   </w:abstractNum>
-  <w:abstractNum w:abstractNumId="3" w15:restartNumberingAfterBreak="0">
+  <w:abstractNum w:abstractNumId="4" w15:restartNumberingAfterBreak="0">
     <w:nsid w:val="780F29DE"/>
     <w:multiLevelType w:val="multilevel"/>
     <w:tmpl w:val="B87273D8"/>
@@ -2065,7 +2321,7 @@
       </w:rPr>
     </w:lvl>
   </w:abstractNum>
-  <w:abstractNum w:abstractNumId="4" w15:restartNumberingAfterBreak="0">
+  <w:abstractNum w:abstractNumId="5" w15:restartNumberingAfterBreak="0">
     <w:nsid w:val="7C343A81"/>
     <w:multiLevelType w:val="hybridMultilevel"/>
     <w:tmpl w:val="A4CA8C7C"/>
@@ -2155,19 +2411,22 @@
     </w:lvl>
   </w:abstractNum>
   <w:num w:numId="1" w16cid:durableId="682324345">
-    <w:abstractNumId w:val="2"/>
+    <w:abstractNumId w:val="3"/>
   </w:num>
   <w:num w:numId="2" w16cid:durableId="1483767214">
-    <w:abstractNumId w:val="3"/>
+    <w:abstractNumId w:val="4"/>
   </w:num>
   <w:num w:numId="3" w16cid:durableId="108553576">
-    <w:abstractNumId w:val="1"/>
+    <w:abstractNumId w:val="2"/>
   </w:num>
   <w:num w:numId="4" w16cid:durableId="1515221987">
     <w:abstractNumId w:val="0"/>
   </w:num>
   <w:num w:numId="5" w16cid:durableId="766464030">
-    <w:abstractNumId w:val="4"/>
+    <w:abstractNumId w:val="5"/>
+  </w:num>
+  <w:num w:numId="6" w16cid:durableId="2040279463">
+    <w:abstractNumId w:val="1"/>
   </w:num>
 </w:numbering>
 </file>
@@ -2775,7 +3034,6 @@
   <w:style w:type="character" w:default="1" w:styleId="Fuentedeprrafopredeter">
     <w:name w:val="Default Paragraph Font"/>
     <w:uiPriority w:val="1"/>
-    <w:semiHidden/>
     <w:unhideWhenUsed/>
   </w:style>
   <w:style w:type="table" w:default="1" w:styleId="Tablanormal">

</xml_diff>